<commit_message>
Player simulado, avatares, ajustes de assinatura e tratamento de erros
</commit_message>
<xml_diff>
--- a/docs/01-documento-de-analise.docx
+++ b/docs/01-documento-de-analise.docx
@@ -2167,7 +2167,7 @@
               <w:rPr>
                 <w:sz w:val="19"/>
               </w:rPr>
-              <w:t>O usuário deve poder consultar a assinatura vigente, o histórico de assinaturas e cancelar a assinatura atual.</w:t>
+              <w:t>O usuário deve poder consultar a assinatura vigente e o histórico de assinaturas, e trocar de plano.</w:t>
             </w:r>
           </w:p>
         </w:tc>
@@ -3138,7 +3138,7 @@
                 <w:color w:val="1E5B3C"/>
                 <w:sz w:val="19"/>
               </w:rPr>
-              <w:t>V5</w:t>
+              <w:t>V6</w:t>
             </w:r>
             <w:r>
               <w:rPr>
@@ -6122,7 +6122,7 @@
       <w:r>
         <w:drawing>
           <wp:inline xmlns:a="http://schemas.openxmlformats.org/drawingml/2006/main" xmlns:pic="http://schemas.openxmlformats.org/drawingml/2006/picture">
-            <wp:extent cx="5733288" cy="5022183"/>
+            <wp:extent cx="5733288" cy="4942183"/>
             <wp:docPr id="2" name="Picture 2"/>
             <wp:cNvGraphicFramePr>
               <a:graphicFrameLocks noChangeAspect="1"/>
@@ -6143,7 +6143,7 @@
                   <pic:spPr>
                     <a:xfrm>
                       <a:off x="0" y="0"/>
-                      <a:ext cx="5733288" cy="5022183"/>
+                      <a:ext cx="5733288" cy="4942183"/>
                     </a:xfrm>
                     <a:prstGeom prst="rect"/>
                   </pic:spPr>
@@ -6222,7 +6222,7 @@
         <w:t>Assinatura.cancelar()</w:t>
       </w:r>
       <w:r>
-        <w:t xml:space="preserve"> — encerra a assinatura registrando a data de término;</w:t>
+        <w:t xml:space="preserve"> — encerra a assinatura anterior quando o assinante troca de plano, registrando a data de término;</w:t>
       </w:r>
     </w:p>
     <w:p>

</xml_diff>